<commit_message>
refactor layout and add new pages for team, catalog, history, contact, terms, privacy, and cart
</commit_message>
<xml_diff>
--- a/Konzept/Konzept_Lorin_Levin.docx
+++ b/Konzept/Konzept_Lorin_Levin.docx
@@ -9,6 +9,12 @@
           <w:rFonts w:ascii="Arial" w:hAnsi="Arial" w:cs="Arial"/>
         </w:rPr>
       </w:pPr>
+      <w:r>
+        <w:rPr>
+          <w:rFonts w:ascii="Arial" w:hAnsi="Arial" w:cs="Arial"/>
+        </w:rPr>
+        <w:t>#</w:t>
+      </w:r>
       <w:r>
         <w:rPr>
           <w:rFonts w:ascii="Arial" w:hAnsi="Arial" w:cs="Arial"/>
@@ -227,16 +233,31 @@
         <w:pStyle w:val="Listenabsatz"/>
       </w:pPr>
       <w:r>
-        <w:t>Levin hat gesagt er braucht noch einen Webshop für seine Kleidermarke(</w:t>
-      </w:r>
+        <w:t xml:space="preserve">Levin hat gesagt er braucht noch einen Webshop für seine </w:t>
+      </w:r>
+      <w:proofErr w:type="gramStart"/>
+      <w:r>
+        <w:t>Kleidermarke(</w:t>
+      </w:r>
+      <w:proofErr w:type="spellStart"/>
+      <w:proofErr w:type="gramEnd"/>
       <w:r>
         <w:rPr>
           <w:rFonts w:cs="Arial"/>
         </w:rPr>
         <w:t>Cantonilli</w:t>
       </w:r>
-      <w:r>
-        <w:t>) und darum nutzen wir diese Möglichkeit diesen in den 3 Tagen die wir haben zu machen.</w:t>
+      <w:proofErr w:type="spellEnd"/>
+      <w:r>
+        <w:t xml:space="preserve">) und darum nutzen wir diese Möglichkeit diesen in den 3 </w:t>
+      </w:r>
+      <w:proofErr w:type="gramStart"/>
+      <w:r>
+        <w:t>Tagen</w:t>
+      </w:r>
+      <w:proofErr w:type="gramEnd"/>
+      <w:r>
+        <w:t xml:space="preserve"> die wir haben zu machen.</w:t>
       </w:r>
     </w:p>
     <w:p>
@@ -282,7 +303,15 @@
         <w:t xml:space="preserve"> </w:t>
       </w:r>
       <w:r>
-        <w:t xml:space="preserve">und beschreibt für mindestens zwei Konkurrenten, was sie besonders gut oder auch besonders schlecht machen auf/mit ihrer Webseite. </w:t>
+        <w:t xml:space="preserve">und beschreibt für mindestens zwei Konkurrenten, was sie besonders gut oder auch besonders schlecht </w:t>
+      </w:r>
+      <w:proofErr w:type="gramStart"/>
+      <w:r>
+        <w:t>machen</w:t>
+      </w:r>
+      <w:proofErr w:type="gramEnd"/>
+      <w:r>
+        <w:t xml:space="preserve"> auf/mit ihrer Webseite. </w:t>
       </w:r>
     </w:p>
     <w:p>
@@ -719,7 +748,23 @@
           </w:p>
           <w:p>
             <w:r>
-              <w:t>Keine Grosse Ziele und/oder Ängste. Lebt sein leben eher ruhig ist viel draussen mit Freunden und vermeidet Konflikte.</w:t>
+              <w:t xml:space="preserve">Keine </w:t>
+            </w:r>
+            <w:proofErr w:type="spellStart"/>
+            <w:r>
+              <w:t>Grosse</w:t>
+            </w:r>
+            <w:proofErr w:type="spellEnd"/>
+            <w:r>
+              <w:t xml:space="preserve"> Ziele und/oder Ängste. Lebt sein </w:t>
+            </w:r>
+            <w:proofErr w:type="spellStart"/>
+            <w:r>
+              <w:t>leben</w:t>
+            </w:r>
+            <w:proofErr w:type="spellEnd"/>
+            <w:r>
+              <w:t xml:space="preserve"> eher ruhig ist viel draussen mit Freunden und vermeidet Konflikte.</w:t>
             </w:r>
           </w:p>
         </w:tc>
@@ -870,15 +915,97 @@
                 <w:i/>
                 <w:iCs/>
               </w:rPr>
-              <w:t>Bar. Der eigentliche Inhalt kommt erst unter der Nav-Bar und wird aus einem «Drehkarussel» bestehen bei dem man sich durch die Produkteauswahl klicken kann. Ganz unten an der Website kommt ein Footer mit terms &amp; conditions, privacy</w:t>
-            </w:r>
+              <w:t>Bar. Der eigentliche Inhalt kommt erst unter der Nav-Bar und wird aus einem «</w:t>
+            </w:r>
+            <w:proofErr w:type="spellStart"/>
             <w:r>
               <w:rPr>
                 <w:rFonts w:cs="Arial"/>
                 <w:i/>
                 <w:iCs/>
               </w:rPr>
-              <w:t xml:space="preserve"> und contact.</w:t>
+              <w:t>Drehkarussel</w:t>
+            </w:r>
+            <w:proofErr w:type="spellEnd"/>
+            <w:r>
+              <w:rPr>
+                <w:rFonts w:cs="Arial"/>
+                <w:i/>
+                <w:iCs/>
+              </w:rPr>
+              <w:t xml:space="preserve">» bestehen bei dem man sich durch die Produkteauswahl klicken kann. Ganz unten an der Website kommt ein Footer mit </w:t>
+            </w:r>
+            <w:proofErr w:type="spellStart"/>
+            <w:r>
+              <w:rPr>
+                <w:rFonts w:cs="Arial"/>
+                <w:i/>
+                <w:iCs/>
+              </w:rPr>
+              <w:t>terms</w:t>
+            </w:r>
+            <w:proofErr w:type="spellEnd"/>
+            <w:r>
+              <w:rPr>
+                <w:rFonts w:cs="Arial"/>
+                <w:i/>
+                <w:iCs/>
+              </w:rPr>
+              <w:t xml:space="preserve"> &amp; </w:t>
+            </w:r>
+            <w:proofErr w:type="spellStart"/>
+            <w:r>
+              <w:rPr>
+                <w:rFonts w:cs="Arial"/>
+                <w:i/>
+                <w:iCs/>
+              </w:rPr>
+              <w:t>conditions</w:t>
+            </w:r>
+            <w:proofErr w:type="spellEnd"/>
+            <w:r>
+              <w:rPr>
+                <w:rFonts w:cs="Arial"/>
+                <w:i/>
+                <w:iCs/>
+              </w:rPr>
+              <w:t xml:space="preserve">, </w:t>
+            </w:r>
+            <w:proofErr w:type="spellStart"/>
+            <w:r>
+              <w:rPr>
+                <w:rFonts w:cs="Arial"/>
+                <w:i/>
+                <w:iCs/>
+              </w:rPr>
+              <w:t>privacy</w:t>
+            </w:r>
+            <w:proofErr w:type="spellEnd"/>
+            <w:r>
+              <w:rPr>
+                <w:rFonts w:cs="Arial"/>
+                <w:i/>
+                <w:iCs/>
+              </w:rPr>
+              <w:t xml:space="preserve"> und </w:t>
+            </w:r>
+            <w:proofErr w:type="spellStart"/>
+            <w:r>
+              <w:rPr>
+                <w:rFonts w:cs="Arial"/>
+                <w:i/>
+                <w:iCs/>
+              </w:rPr>
+              <w:t>contact</w:t>
+            </w:r>
+            <w:proofErr w:type="spellEnd"/>
+            <w:r>
+              <w:rPr>
+                <w:rFonts w:cs="Arial"/>
+                <w:i/>
+                <w:iCs/>
+              </w:rPr>
+              <w:t>.</w:t>
             </w:r>
           </w:p>
         </w:tc>
@@ -905,8 +1032,16 @@
               <w:rPr>
                 <w:rFonts w:cs="Arial"/>
               </w:rPr>
-              <w:t>1: About us</w:t>
-            </w:r>
+              <w:t xml:space="preserve">1: About </w:t>
+            </w:r>
+            <w:proofErr w:type="spellStart"/>
+            <w:r>
+              <w:rPr>
+                <w:rFonts w:cs="Arial"/>
+              </w:rPr>
+              <w:t>us</w:t>
+            </w:r>
+            <w:proofErr w:type="spellEnd"/>
           </w:p>
         </w:tc>
         <w:tc>
@@ -1841,6 +1976,7 @@
         </w:rPr>
         <w:t xml:space="preserve">, </w:t>
       </w:r>
+      <w:proofErr w:type="spellStart"/>
       <w:r>
         <w:rPr>
           <w:b/>
@@ -1848,6 +1984,7 @@
         </w:rPr>
         <w:t>Cinzel</w:t>
       </w:r>
+      <w:proofErr w:type="spellEnd"/>
       <w:r>
         <w:rPr>
           <w:b/>
@@ -2002,7 +2139,23 @@
           <w:sz w:val="20"/>
           <w:szCs w:val="20"/>
         </w:rPr>
-        <w:t xml:space="preserve">Checkliste Testing </w:t>
+        <w:t xml:space="preserve">Checkliste </w:t>
+      </w:r>
+      <w:proofErr w:type="spellStart"/>
+      <w:r>
+        <w:rPr>
+          <w:sz w:val="20"/>
+          <w:szCs w:val="20"/>
+        </w:rPr>
+        <w:t>Testing</w:t>
+      </w:r>
+      <w:proofErr w:type="spellEnd"/>
+      <w:r>
+        <w:rPr>
+          <w:sz w:val="20"/>
+          <w:szCs w:val="20"/>
+        </w:rPr>
+        <w:t xml:space="preserve"> </w:t>
       </w:r>
     </w:p>
     <w:tbl>
@@ -3331,13 +3484,23 @@
               </w:rPr>
               <w:t xml:space="preserve">Inhalt: </w:t>
             </w:r>
+            <w:proofErr w:type="gramStart"/>
             <w:r>
               <w:rPr>
                 <w:bCs/>
                 <w:sz w:val="20"/>
                 <w:szCs w:val="20"/>
               </w:rPr>
-              <w:t>Orthographie und</w:t>
+              <w:t>Orthographie</w:t>
+            </w:r>
+            <w:proofErr w:type="gramEnd"/>
+            <w:r>
+              <w:rPr>
+                <w:bCs/>
+                <w:sz w:val="20"/>
+                <w:szCs w:val="20"/>
+              </w:rPr>
+              <w:t xml:space="preserve"> und</w:t>
             </w:r>
             <w:r>
               <w:rPr>
@@ -3500,7 +3663,25 @@
                 <w:sz w:val="20"/>
                 <w:szCs w:val="20"/>
               </w:rPr>
-              <w:t xml:space="preserve">Exploratives Testing: </w:t>
+              <w:t xml:space="preserve">Exploratives </w:t>
+            </w:r>
+            <w:proofErr w:type="spellStart"/>
+            <w:r>
+              <w:rPr>
+                <w:b/>
+                <w:sz w:val="20"/>
+                <w:szCs w:val="20"/>
+              </w:rPr>
+              <w:t>Testing</w:t>
+            </w:r>
+            <w:proofErr w:type="spellEnd"/>
+            <w:r>
+              <w:rPr>
+                <w:b/>
+                <w:sz w:val="20"/>
+                <w:szCs w:val="20"/>
+              </w:rPr>
+              <w:t xml:space="preserve">: </w:t>
             </w:r>
             <w:r>
               <w:rPr>
@@ -4429,6 +4610,7 @@
   <w:style w:type="character" w:default="1" w:styleId="Absatz-Standardschriftart">
     <w:name w:val="Default Paragraph Font"/>
     <w:uiPriority w:val="1"/>
+    <w:semiHidden/>
     <w:unhideWhenUsed/>
   </w:style>
   <w:style w:type="table" w:default="1" w:styleId="NormaleTabelle">

</xml_diff>